<commit_message>
feat: update template with student placeholders, add textarea for long fields
Replace template.docx with teacher-prepared version containing [bracket]
placeholders. Short placeholders render as inline inputs, long ones
(abstracts) render as auto-resizing textareas.

Co-Authored-By: Claude Sonnet 4.6 <noreply@anthropic.com>
</commit_message>
<xml_diff>
--- a/template.docx
+++ b/template.docx
@@ -117,14 +117,31 @@
         <w:rPr>
           <w:sz w:val="28"/>
           <w:szCs w:val="28"/>
-        </w:rPr>
-      </w:pPr>
+          <w:lang w:val="en-US"/>
+        </w:rPr>
+      </w:pPr>
+      <w:r>
+        <w:rPr>
+          <w:sz w:val="28"/>
+          <w:szCs w:val="28"/>
+          <w:lang w:val="en-US"/>
+        </w:rPr>
+        <w:t>[</w:t>
+      </w:r>
       <w:r>
         <w:rPr>
           <w:sz w:val="28"/>
           <w:szCs w:val="28"/>
         </w:rPr>
         <w:t>Білімалушының  тегі, аты-жөні</w:t>
+      </w:r>
+      <w:r>
+        <w:rPr>
+          <w:sz w:val="28"/>
+          <w:szCs w:val="28"/>
+          <w:lang w:val="en-US"/>
+        </w:rPr>
+        <w:t>]</w:t>
       </w:r>
     </w:p>
     <w:p>
@@ -133,14 +150,31 @@
         <w:rPr>
           <w:sz w:val="28"/>
           <w:szCs w:val="28"/>
-        </w:rPr>
-      </w:pPr>
+          <w:lang w:val="en-US"/>
+        </w:rPr>
+      </w:pPr>
+      <w:r>
+        <w:rPr>
+          <w:sz w:val="28"/>
+          <w:szCs w:val="28"/>
+          <w:lang w:val="en-US"/>
+        </w:rPr>
+        <w:t>[</w:t>
+      </w:r>
       <w:r>
         <w:rPr>
           <w:sz w:val="28"/>
           <w:szCs w:val="28"/>
         </w:rPr>
         <w:t>Білімалушының  тегі, аты-жөні</w:t>
+      </w:r>
+      <w:r>
+        <w:rPr>
+          <w:sz w:val="28"/>
+          <w:szCs w:val="28"/>
+          <w:lang w:val="en-US"/>
+        </w:rPr>
+        <w:t>]</w:t>
       </w:r>
     </w:p>
     <w:p>
@@ -149,14 +183,31 @@
         <w:rPr>
           <w:sz w:val="28"/>
           <w:szCs w:val="28"/>
-        </w:rPr>
-      </w:pPr>
+          <w:lang w:val="en-US"/>
+        </w:rPr>
+      </w:pPr>
+      <w:r>
+        <w:rPr>
+          <w:sz w:val="28"/>
+          <w:szCs w:val="28"/>
+          <w:lang w:val="en-US"/>
+        </w:rPr>
+        <w:t>[</w:t>
+      </w:r>
       <w:r>
         <w:rPr>
           <w:sz w:val="28"/>
           <w:szCs w:val="28"/>
         </w:rPr>
         <w:t>Білімалушының  тегі, аты-жөні</w:t>
+      </w:r>
+      <w:r>
+        <w:rPr>
+          <w:sz w:val="28"/>
+          <w:szCs w:val="28"/>
+          <w:lang w:val="en-US"/>
+        </w:rPr>
+        <w:t>]</w:t>
       </w:r>
     </w:p>
     <w:p>
@@ -165,8 +216,17 @@
         <w:rPr>
           <w:sz w:val="28"/>
           <w:szCs w:val="28"/>
-        </w:rPr>
-      </w:pPr>
+          <w:lang w:val="en-US"/>
+        </w:rPr>
+      </w:pPr>
+      <w:r>
+        <w:rPr>
+          <w:sz w:val="28"/>
+          <w:szCs w:val="28"/>
+          <w:lang w:val="en-US"/>
+        </w:rPr>
+        <w:t>[</w:t>
+      </w:r>
       <w:r>
         <w:rPr>
           <w:sz w:val="28"/>
@@ -174,6 +234,24 @@
         </w:rPr>
         <w:t>Білімалушының  тегі, аты-жөні</w:t>
       </w:r>
+      <w:r>
+        <w:rPr>
+          <w:sz w:val="28"/>
+          <w:szCs w:val="28"/>
+          <w:lang w:val="en-US"/>
+        </w:rPr>
+        <w:t>]</w:t>
+      </w:r>
+    </w:p>
+    <w:p>
+      <w:pPr>
+        <w:jc w:val="center"/>
+        <w:rPr>
+          <w:sz w:val="28"/>
+          <w:szCs w:val="28"/>
+          <w:lang w:val="en-US"/>
+        </w:rPr>
+      </w:pPr>
     </w:p>
     <w:p>
       <w:pPr>
@@ -466,6 +544,7 @@
           <w:color w:val="000000" w:themeColor="text1"/>
           <w:sz w:val="24"/>
           <w:szCs w:val="24"/>
+          <w:lang w:val="en-US"/>
         </w:rPr>
       </w:pPr>
       <w:r>
@@ -476,6 +555,16 @@
           <w:szCs w:val="24"/>
         </w:rPr>
         <w:t xml:space="preserve">Тақырыбы: </w:t>
+      </w:r>
+      <w:r>
+        <w:rPr>
+          <w:b/>
+          <w:bCs/>
+          <w:sz w:val="24"/>
+          <w:szCs w:val="24"/>
+          <w:lang w:val="en-US"/>
+        </w:rPr>
+        <w:t>[</w:t>
       </w:r>
       <w:r>
         <w:rPr>
@@ -487,6 +576,17 @@
         </w:rPr>
         <w:t>Сіздің дипломдық жұмыстың тақырыптың аты тұратын жер</w:t>
       </w:r>
+      <w:r>
+        <w:rPr>
+          <w:b/>
+          <w:bCs/>
+          <w:color w:val="000000" w:themeColor="text1"/>
+          <w:sz w:val="24"/>
+          <w:szCs w:val="24"/>
+          <w:lang w:val="en-US"/>
+        </w:rPr>
+        <w:t>]</w:t>
+      </w:r>
     </w:p>
     <w:p>
       <w:pPr>
@@ -496,6 +596,7 @@
           <w:bCs/>
           <w:sz w:val="24"/>
           <w:szCs w:val="24"/>
+          <w:lang w:val="en-US"/>
         </w:rPr>
       </w:pPr>
       <w:r>
@@ -504,8 +605,28 @@
           <w:bCs/>
           <w:sz w:val="24"/>
           <w:szCs w:val="24"/>
+          <w:lang w:val="en-US"/>
+        </w:rPr>
+        <w:t>[</w:t>
+      </w:r>
+      <w:r>
+        <w:rPr>
+          <w:b/>
+          <w:bCs/>
+          <w:sz w:val="24"/>
+          <w:szCs w:val="24"/>
         </w:rPr>
         <w:t>Place where your diploma documentation topic is held</w:t>
+      </w:r>
+      <w:r>
+        <w:rPr>
+          <w:b/>
+          <w:bCs/>
+          <w:sz w:val="24"/>
+          <w:szCs w:val="24"/>
+          <w:lang w:val="en-US"/>
+        </w:rPr>
+        <w:t>]</w:t>
       </w:r>
     </w:p>
     <w:p>
@@ -584,9 +705,33 @@
               <w:rPr>
                 <w:sz w:val="28"/>
                 <w:szCs w:val="28"/>
-                <w:lang w:val="en-KZ"/>
-              </w:rPr>
-              <w:t>__тобының білімалушысы</w:t>
+                <w:lang w:val="en-US"/>
+              </w:rPr>
+              <w:t>[</w:t>
+            </w:r>
+            <w:r>
+              <w:rPr>
+                <w:sz w:val="28"/>
+                <w:szCs w:val="28"/>
+                <w:lang w:val="en-KZ"/>
+              </w:rPr>
+              <w:t>__</w:t>
+            </w:r>
+            <w:r>
+              <w:rPr>
+                <w:sz w:val="28"/>
+                <w:szCs w:val="28"/>
+                <w:lang w:val="en-US"/>
+              </w:rPr>
+              <w:t xml:space="preserve">] </w:t>
+            </w:r>
+            <w:r>
+              <w:rPr>
+                <w:sz w:val="28"/>
+                <w:szCs w:val="28"/>
+                <w:lang w:val="en-KZ"/>
+              </w:rPr>
+              <w:t>тобының білімалушысы</w:t>
             </w:r>
           </w:p>
         </w:tc>
@@ -715,9 +860,41 @@
               <w:rPr>
                 <w:sz w:val="28"/>
                 <w:szCs w:val="28"/>
-                <w:lang w:val="en-KZ"/>
-              </w:rPr>
-              <w:t>__тобының білімалушысы</w:t>
+                <w:lang w:val="en-US"/>
+              </w:rPr>
+              <w:t>[</w:t>
+            </w:r>
+            <w:r>
+              <w:rPr>
+                <w:sz w:val="28"/>
+                <w:szCs w:val="28"/>
+                <w:lang w:val="en-KZ"/>
+              </w:rPr>
+              <w:t>__</w:t>
+            </w:r>
+            <w:r>
+              <w:rPr>
+                <w:sz w:val="28"/>
+                <w:szCs w:val="28"/>
+                <w:lang w:val="en-US"/>
+              </w:rPr>
+              <w:t>]</w:t>
+            </w:r>
+            <w:r>
+              <w:rPr>
+                <w:sz w:val="28"/>
+                <w:szCs w:val="28"/>
+                <w:lang w:val="en-US"/>
+              </w:rPr>
+              <w:t xml:space="preserve"> </w:t>
+            </w:r>
+            <w:r>
+              <w:rPr>
+                <w:sz w:val="28"/>
+                <w:szCs w:val="28"/>
+                <w:lang w:val="en-KZ"/>
+              </w:rPr>
+              <w:t>тобының білімалушысы</w:t>
             </w:r>
           </w:p>
         </w:tc>
@@ -846,9 +1023,41 @@
               <w:rPr>
                 <w:sz w:val="28"/>
                 <w:szCs w:val="28"/>
-                <w:lang w:val="en-KZ"/>
-              </w:rPr>
-              <w:t>__тобының білімалушысы</w:t>
+                <w:lang w:val="en-US"/>
+              </w:rPr>
+              <w:t>[</w:t>
+            </w:r>
+            <w:r>
+              <w:rPr>
+                <w:sz w:val="28"/>
+                <w:szCs w:val="28"/>
+                <w:lang w:val="en-KZ"/>
+              </w:rPr>
+              <w:t>__</w:t>
+            </w:r>
+            <w:r>
+              <w:rPr>
+                <w:sz w:val="28"/>
+                <w:szCs w:val="28"/>
+                <w:lang w:val="en-US"/>
+              </w:rPr>
+              <w:t>]</w:t>
+            </w:r>
+            <w:r>
+              <w:rPr>
+                <w:sz w:val="28"/>
+                <w:szCs w:val="28"/>
+                <w:lang w:val="en-US"/>
+              </w:rPr>
+              <w:t xml:space="preserve"> </w:t>
+            </w:r>
+            <w:r>
+              <w:rPr>
+                <w:sz w:val="28"/>
+                <w:szCs w:val="28"/>
+                <w:lang w:val="en-KZ"/>
+              </w:rPr>
+              <w:t>тобының білімалушысы</w:t>
             </w:r>
           </w:p>
         </w:tc>
@@ -977,9 +1186,41 @@
               <w:rPr>
                 <w:sz w:val="28"/>
                 <w:szCs w:val="28"/>
-                <w:lang w:val="en-KZ"/>
-              </w:rPr>
-              <w:t>__тобының білімалушысы</w:t>
+                <w:lang w:val="en-US"/>
+              </w:rPr>
+              <w:t>[</w:t>
+            </w:r>
+            <w:r>
+              <w:rPr>
+                <w:sz w:val="28"/>
+                <w:szCs w:val="28"/>
+                <w:lang w:val="en-KZ"/>
+              </w:rPr>
+              <w:t>__</w:t>
+            </w:r>
+            <w:r>
+              <w:rPr>
+                <w:sz w:val="28"/>
+                <w:szCs w:val="28"/>
+                <w:lang w:val="en-US"/>
+              </w:rPr>
+              <w:t>]</w:t>
+            </w:r>
+            <w:r>
+              <w:rPr>
+                <w:sz w:val="28"/>
+                <w:szCs w:val="28"/>
+                <w:lang w:val="en-US"/>
+              </w:rPr>
+              <w:t xml:space="preserve"> </w:t>
+            </w:r>
+            <w:r>
+              <w:rPr>
+                <w:sz w:val="28"/>
+                <w:szCs w:val="28"/>
+                <w:lang w:val="en-KZ"/>
+              </w:rPr>
+              <w:t>тобының білімалушысы</w:t>
             </w:r>
           </w:p>
         </w:tc>
@@ -1365,14 +1606,31 @@
         <w:rPr>
           <w:sz w:val="28"/>
           <w:szCs w:val="28"/>
-        </w:rPr>
-      </w:pPr>
+          <w:lang w:val="en-US"/>
+        </w:rPr>
+      </w:pPr>
+      <w:r>
+        <w:rPr>
+          <w:sz w:val="28"/>
+          <w:szCs w:val="28"/>
+          <w:lang w:val="en-US"/>
+        </w:rPr>
+        <w:t>[</w:t>
+      </w:r>
       <w:r>
         <w:rPr>
           <w:sz w:val="28"/>
           <w:szCs w:val="28"/>
         </w:rPr>
         <w:t>Бұл аңдатпаның орын ауыстыратын мәтіні. Осы бөлімде сіз зерттеуіңіздің негізгі мақсаттары, міндеттері, әдістері және нәтижелері туралы қысқаша жазасыз. Аңдатпа жұмыстың негізгі мазмұнын және маңызды нәтижелерін қысқаша көрсетуі тиіс. Ол зерттеудің мақсатын, қолданылған әдістерді және негізгі нәтижелерді қамтуы керек. Аңдатпа түсінікті әрі қысқа болуы керек, оқырмандарға жұмысыңыздың мәні туралы жалпы түсінік береді.</w:t>
+      </w:r>
+      <w:r>
+        <w:rPr>
+          <w:sz w:val="28"/>
+          <w:szCs w:val="28"/>
+          <w:lang w:val="en-US"/>
+        </w:rPr>
+        <w:t>]</w:t>
       </w:r>
     </w:p>
     <w:p>

</xml_diff>